<commit_message>
Update final Project B report
</commit_message>
<xml_diff>
--- a/report/report.docx
+++ b/report/report.docx
@@ -2,6 +2,76 @@
 <file path=word/document.xml><?xml version="1.0" encoding="utf-8"?>
 <w:document xmlns:wpc="http://schemas.microsoft.com/office/word/2010/wordprocessingCanvas" xmlns:cx="http://schemas.microsoft.com/office/drawing/2014/chartex" xmlns:cx1="http://schemas.microsoft.com/office/drawing/2015/9/8/chartex" xmlns:cx2="http://schemas.microsoft.com/office/drawing/2015/10/21/chartex" xmlns:cx3="http://schemas.microsoft.com/office/drawing/2016/5/9/chartex" xmlns:cx4="http://schemas.microsoft.com/office/drawing/2016/5/10/chartex" xmlns:cx5="http://schemas.microsoft.com/office/drawing/2016/5/11/chartex" xmlns:cx6="http://schemas.microsoft.com/office/drawing/2016/5/12/chartex" xmlns:cx7="http://schemas.microsoft.com/office/drawing/2016/5/13/chartex" xmlns:cx8="http://schemas.microsoft.com/office/drawing/2016/5/14/chartex" xmlns:mc="http://schemas.openxmlformats.org/markup-compatibility/2006" xmlns:aink="http://schemas.microsoft.com/office/drawing/2016/ink" xmlns:am3d="http://schemas.microsoft.com/office/drawing/2017/model3d" xmlns:o="urn:schemas-microsoft-com:office:office" xmlns:oel="http://schemas.microsoft.com/office/2019/extlst" xmlns:r="http://schemas.openxmlformats.org/officeDocument/2006/relationships" xmlns:m="http://schemas.openxmlformats.org/officeDocument/2006/math" xmlns:v="urn:schemas-microsoft-com:vml" xmlns:wp14="http://schemas.microsoft.com/office/word/2010/wordprocessingDrawing" xmlns:wp="http://schemas.openxmlformats.org/drawingml/2006/wordprocessingDrawing" xmlns:w10="urn:schemas-microsoft-com:office:word" xmlns:w="http://schemas.openxmlformats.org/wordprocessingml/2006/main" xmlns:w14="http://schemas.microsoft.com/office/word/2010/wordml" xmlns:w15="http://schemas.microsoft.com/office/word/2012/wordml" xmlns:w16cex="http://schemas.microsoft.com/office/word/2018/wordml/cex" xmlns:w16cid="http://schemas.microsoft.com/office/word/2016/wordml/cid" xmlns:w16="http://schemas.microsoft.com/office/word/2018/wordml" xmlns:w16du="http://schemas.microsoft.com/office/word/2023/wordml/word16du" xmlns:w16sdtdh="http://schemas.microsoft.com/office/word/2020/wordml/sdtdatahash" xmlns:w16se="http://schemas.microsoft.com/office/word/2015/wordml/symex" xmlns:wpg="http://schemas.microsoft.com/office/word/2010/wordprocessingGroup" xmlns:wpi="http://schemas.microsoft.com/office/word/2010/wordprocessingInk" xmlns:wne="http://schemas.microsoft.com/office/word/2006/wordml" xmlns:wps="http://schemas.microsoft.com/office/word/2010/wordprocessingShape" mc:Ignorable="w14 w15 w16se w16cid w16 w16cex w16sdtdh w16du wp14">
   <w:body>
+    <w:p>
+      <w:pPr>
+        <w:rPr>
+          <w:rFonts w:ascii="Times New Roman" w:hAnsi="Times New Roman" w:cs="Times New Roman"/>
+          <w:sz w:val="22"/>
+          <w:szCs w:val="22"/>
+          <w:lang w:val="en-US"/>
+        </w:rPr>
+      </w:pPr>
+      <w:proofErr w:type="spellStart"/>
+      <w:r>
+        <w:rPr>
+          <w:rFonts w:ascii="Times New Roman" w:hAnsi="Times New Roman" w:cs="Times New Roman"/>
+          <w:sz w:val="22"/>
+          <w:szCs w:val="22"/>
+          <w:lang w:val="en-US"/>
+        </w:rPr>
+        <w:t>Github</w:t>
+      </w:r>
+      <w:proofErr w:type="spellEnd"/>
+      <w:r>
+        <w:rPr>
+          <w:rFonts w:ascii="Times New Roman" w:hAnsi="Times New Roman" w:cs="Times New Roman"/>
+          <w:sz w:val="22"/>
+          <w:szCs w:val="22"/>
+          <w:lang w:val="en-US"/>
+        </w:rPr>
+        <w:t xml:space="preserve"> Link: </w:t>
+      </w:r>
+      <w:hyperlink r:id="rId5" w:history="1">
+        <w:r>
+          <w:rPr>
+            <w:rStyle w:val="Hyperlink"/>
+            <w:rFonts w:ascii="Times New Roman" w:hAnsi="Times New Roman" w:cs="Times New Roman"/>
+            <w:sz w:val="22"/>
+            <w:szCs w:val="22"/>
+            <w:lang w:val="en-US"/>
+          </w:rPr>
+          <w:t>https://github.com/winson-karim/z5642004_projectB</w:t>
+        </w:r>
+      </w:hyperlink>
+    </w:p>
+    <w:p>
+      <w:pPr>
+        <w:rPr>
+          <w:rFonts w:ascii="Times New Roman" w:hAnsi="Times New Roman" w:cs="Times New Roman"/>
+          <w:sz w:val="22"/>
+          <w:szCs w:val="22"/>
+          <w:lang w:val="en-US"/>
+        </w:rPr>
+      </w:pPr>
+      <w:r>
+        <w:rPr>
+          <w:rFonts w:ascii="Times New Roman" w:hAnsi="Times New Roman" w:cs="Times New Roman"/>
+          <w:sz w:val="22"/>
+          <w:szCs w:val="22"/>
+          <w:lang w:val="en-US"/>
+        </w:rPr>
+        <w:t xml:space="preserve">Streamlit App link: </w:t>
+      </w:r>
+      <w:r>
+        <w:rPr>
+          <w:rFonts w:ascii="Times New Roman" w:hAnsi="Times New Roman" w:cs="Times New Roman"/>
+          <w:sz w:val="22"/>
+          <w:szCs w:val="22"/>
+          <w:lang w:val="en-US"/>
+        </w:rPr>
+        <w:t>https://vestra.streamlit.app</w:t>
+      </w:r>
+    </w:p>
     <w:p>
       <w:pPr>
         <w:rPr>
@@ -431,6 +501,7 @@
           <w:szCs w:val="22"/>
           <w:lang w:val="en-US"/>
         </w:rPr>
+        <w:lastRenderedPageBreak/>
         <w:t>All</w:t>
       </w:r>
       <w:r>
@@ -440,17 +511,7 @@
           <w:szCs w:val="22"/>
           <w:lang w:val="en-US"/>
         </w:rPr>
-        <w:t xml:space="preserve"> the optimized portfolios are required to be long-only, with a maximum weight of each individual asset at 20%, and sum of portfolio weight equal to one, such restrictions prohibit any leverage and </w:t>
-      </w:r>
-      <w:r>
-        <w:rPr>
-          <w:rFonts w:ascii="Times New Roman" w:hAnsi="Times New Roman" w:cs="Times New Roman"/>
-          <w:sz w:val="22"/>
-          <w:szCs w:val="22"/>
-          <w:lang w:val="en-US"/>
-        </w:rPr>
-        <w:lastRenderedPageBreak/>
-        <w:t>short positions, and decrease the probability of unstable historical estimates producing an extremely concentrated portfolio of just a small number of assets.</w:t>
+        <w:t xml:space="preserve"> the optimized portfolios are required to be long-only, with a maximum weight of each individual asset at 20%, and sum of portfolio weight equal to one, such restrictions prohibit any leverage and short positions, and decrease the probability of unstable historical estimates producing an extremely concentrated portfolio of just a small number of assets.</w:t>
       </w:r>
     </w:p>
     <w:p>
@@ -704,9 +765,9 @@
             <o:lock v:ext="edit" aspectratio="t"/>
           </v:shapetype>
           <v:shape id="_x0000_i1029" type="#_x0000_t75" alt="" style="width:433.4pt;height:164.1pt;mso-width-percent:0;mso-height-percent:0;mso-width-percent:0;mso-height-percent:0" o:ole="">
-            <v:imagedata r:id="rId5" o:title=""/>
+            <v:imagedata r:id="rId6" o:title=""/>
           </v:shape>
-          <o:OLEObject Type="Embed" ProgID="Excel.Sheet.12" ShapeID="_x0000_i1029" DrawAspect="Content" ObjectID="_1848143463" r:id="rId6"/>
+          <o:OLEObject Type="Embed" ProgID="Excel.Sheet.12" ShapeID="_x0000_i1029" DrawAspect="Content" ObjectID="_1848169360" r:id="rId7"/>
         </w:object>
       </w:r>
     </w:p>
@@ -1214,7 +1275,7 @@
                     <pic:cNvPicPr/>
                   </pic:nvPicPr>
                   <pic:blipFill>
-                    <a:blip r:embed="rId7" cstate="print">
+                    <a:blip r:embed="rId8" cstate="print">
                       <a:extLst>
                         <a:ext uri="{28A0092B-C50C-407E-A947-70E740481C1C}">
                           <a14:useLocalDpi xmlns:a14="http://schemas.microsoft.com/office/drawing/2010/main" val="0"/>
@@ -1337,7 +1398,7 @@
                     <pic:cNvPicPr/>
                   </pic:nvPicPr>
                   <pic:blipFill>
-                    <a:blip r:embed="rId8" cstate="print">
+                    <a:blip r:embed="rId9" cstate="print">
                       <a:extLst>
                         <a:ext uri="{28A0092B-C50C-407E-A947-70E740481C1C}">
                           <a14:useLocalDpi xmlns:a14="http://schemas.microsoft.com/office/drawing/2010/main" val="0"/>
@@ -1524,7 +1585,7 @@
                     <pic:cNvPicPr/>
                   </pic:nvPicPr>
                   <pic:blipFill>
-                    <a:blip r:embed="rId9" cstate="print">
+                    <a:blip r:embed="rId10" cstate="print">
                       <a:extLst>
                         <a:ext uri="{28A0092B-C50C-407E-A947-70E740481C1C}">
                           <a14:useLocalDpi xmlns:a14="http://schemas.microsoft.com/office/drawing/2010/main" val="0"/>
@@ -1829,7 +1890,7 @@
                     <pic:cNvPicPr/>
                   </pic:nvPicPr>
                   <pic:blipFill>
-                    <a:blip r:embed="rId10" cstate="print">
+                    <a:blip r:embed="rId11" cstate="print">
                       <a:extLst>
                         <a:ext uri="{28A0092B-C50C-407E-A947-70E740481C1C}">
                           <a14:useLocalDpi xmlns:a14="http://schemas.microsoft.com/office/drawing/2010/main" val="0"/>
@@ -2072,9 +2133,9 @@
         </w:rPr>
         <w:object w:dxaOrig="15180" w:dyaOrig="980" w14:anchorId="42E3AF13">
           <v:shape id="_x0000_i1028" type="#_x0000_t75" alt="" style="width:432.7pt;height:28.4pt;mso-width-percent:0;mso-height-percent:0;mso-width-percent:0;mso-height-percent:0" o:ole="">
-            <v:imagedata r:id="rId11" o:title=""/>
+            <v:imagedata r:id="rId12" o:title=""/>
           </v:shape>
-          <o:OLEObject Type="Embed" ProgID="Excel.Sheet.12" ShapeID="_x0000_i1028" DrawAspect="Content" ObjectID="_1848143464" r:id="rId12"/>
+          <o:OLEObject Type="Embed" ProgID="Excel.Sheet.12" ShapeID="_x0000_i1028" DrawAspect="Content" ObjectID="_1848169361" r:id="rId13"/>
         </w:object>
       </w:r>
     </w:p>
@@ -2183,7 +2244,7 @@
                     <pic:cNvPicPr/>
                   </pic:nvPicPr>
                   <pic:blipFill>
-                    <a:blip r:embed="rId13" cstate="print">
+                    <a:blip r:embed="rId14" cstate="print">
                       <a:extLst>
                         <a:ext uri="{28A0092B-C50C-407E-A947-70E740481C1C}">
                           <a14:useLocalDpi xmlns:a14="http://schemas.microsoft.com/office/drawing/2010/main" val="0"/>
@@ -2611,9 +2672,9 @@
         </w:rPr>
         <w:object w:dxaOrig="11720" w:dyaOrig="980" w14:anchorId="61A5C540">
           <v:shape id="_x0000_i1027" type="#_x0000_t75" alt="" style="width:434.75pt;height:36.7pt;mso-width-percent:0;mso-height-percent:0;mso-width-percent:0;mso-height-percent:0" o:ole="">
-            <v:imagedata r:id="rId14" o:title=""/>
+            <v:imagedata r:id="rId15" o:title=""/>
           </v:shape>
-          <o:OLEObject Type="Embed" ProgID="Excel.Sheet.12" ShapeID="_x0000_i1027" DrawAspect="Content" ObjectID="_1848143465" r:id="rId15"/>
+          <o:OLEObject Type="Embed" ProgID="Excel.Sheet.12" ShapeID="_x0000_i1027" DrawAspect="Content" ObjectID="_1848169362" r:id="rId16"/>
         </w:object>
       </w:r>
     </w:p>
@@ -2764,9 +2825,9 @@
         </w:rPr>
         <w:object w:dxaOrig="16920" w:dyaOrig="1300" w14:anchorId="4862BA08">
           <v:shape id="_x0000_i1026" type="#_x0000_t75" alt="" style="width:437.55pt;height:32.55pt;mso-width-percent:0;mso-height-percent:0;mso-width-percent:0;mso-height-percent:0" o:ole="">
-            <v:imagedata r:id="rId16" o:title=""/>
+            <v:imagedata r:id="rId17" o:title=""/>
           </v:shape>
-          <o:OLEObject Type="Embed" ProgID="Excel.Sheet.12" ShapeID="_x0000_i1026" DrawAspect="Content" ObjectID="_1848143466" r:id="rId17"/>
+          <o:OLEObject Type="Embed" ProgID="Excel.Sheet.12" ShapeID="_x0000_i1026" DrawAspect="Content" ObjectID="_1848169363" r:id="rId18"/>
         </w:object>
       </w:r>
     </w:p>
@@ -3005,7 +3066,7 @@
                     <pic:cNvPicPr/>
                   </pic:nvPicPr>
                   <pic:blipFill>
-                    <a:blip r:embed="rId18" cstate="print">
+                    <a:blip r:embed="rId19" cstate="print">
                       <a:extLst>
                         <a:ext uri="{28A0092B-C50C-407E-A947-70E740481C1C}">
                           <a14:useLocalDpi xmlns:a14="http://schemas.microsoft.com/office/drawing/2010/main" val="0"/>
@@ -3574,7 +3635,7 @@
         </w:rPr>
         <w:t xml:space="preserve">(7), 282. </w:t>
       </w:r>
-      <w:hyperlink r:id="rId19" w:history="1">
+      <w:hyperlink r:id="rId20" w:history="1">
         <w:r>
           <w:rPr>
             <w:rStyle w:val="Hyperlink"/>
@@ -3632,7 +3693,7 @@
         </w:rPr>
         <w:t xml:space="preserve">. </w:t>
       </w:r>
-      <w:hyperlink r:id="rId20" w:history="1">
+      <w:hyperlink r:id="rId21" w:history="1">
         <w:r>
           <w:rPr>
             <w:rStyle w:val="Hyperlink"/>
@@ -4131,7 +4192,7 @@
                     <pic:cNvPicPr/>
                   </pic:nvPicPr>
                   <pic:blipFill>
-                    <a:blip r:embed="rId21" cstate="print">
+                    <a:blip r:embed="rId22" cstate="print">
                       <a:extLst>
                         <a:ext uri="{28A0092B-C50C-407E-A947-70E740481C1C}">
                           <a14:useLocalDpi xmlns:a14="http://schemas.microsoft.com/office/drawing/2010/main" val="0"/>
@@ -4430,7 +4491,7 @@
                     <pic:cNvPicPr/>
                   </pic:nvPicPr>
                   <pic:blipFill>
-                    <a:blip r:embed="rId22" cstate="print">
+                    <a:blip r:embed="rId23" cstate="print">
                       <a:extLst>
                         <a:ext uri="{28A0092B-C50C-407E-A947-70E740481C1C}">
                           <a14:useLocalDpi xmlns:a14="http://schemas.microsoft.com/office/drawing/2010/main" val="0"/>
@@ -4780,7 +4841,7 @@
                     <pic:cNvPicPr/>
                   </pic:nvPicPr>
                   <pic:blipFill>
-                    <a:blip r:embed="rId23"/>
+                    <a:blip r:embed="rId24"/>
                     <a:stretch>
                       <a:fillRect/>
                     </a:stretch>
@@ -4844,9 +4905,9 @@
         </w:rPr>
         <w:object w:dxaOrig="7820" w:dyaOrig="31060" w14:anchorId="36BEE90B">
           <v:shape id="_x0000_i1025" type="#_x0000_t75" alt="" style="width:272.75pt;height:594.7pt;mso-width-percent:0;mso-height-percent:0;mso-width-percent:0;mso-height-percent:0" o:ole="">
-            <v:imagedata r:id="rId24" o:title=""/>
+            <v:imagedata r:id="rId25" o:title=""/>
           </v:shape>
-          <o:OLEObject Type="Embed" ProgID="Excel.Sheet.12" ShapeID="_x0000_i1025" DrawAspect="Content" ObjectID="_1848143467" r:id="rId25"/>
+          <o:OLEObject Type="Embed" ProgID="Excel.Sheet.12" ShapeID="_x0000_i1025" DrawAspect="Content" ObjectID="_1848169364" r:id="rId26"/>
         </w:object>
       </w:r>
     </w:p>
@@ -4975,7 +5036,7 @@
                     <pic:cNvPicPr/>
                   </pic:nvPicPr>
                   <pic:blipFill>
-                    <a:blip r:embed="rId26" cstate="print">
+                    <a:blip r:embed="rId27" cstate="print">
                       <a:extLst>
                         <a:ext uri="{28A0092B-C50C-407E-A947-70E740481C1C}">
                           <a14:useLocalDpi xmlns:a14="http://schemas.microsoft.com/office/drawing/2010/main" val="0"/>
@@ -5065,7 +5126,7 @@
                     <pic:cNvPicPr/>
                   </pic:nvPicPr>
                   <pic:blipFill>
-                    <a:blip r:embed="rId27" cstate="print">
+                    <a:blip r:embed="rId28" cstate="print">
                       <a:extLst>
                         <a:ext uri="{28A0092B-C50C-407E-A947-70E740481C1C}">
                           <a14:useLocalDpi xmlns:a14="http://schemas.microsoft.com/office/drawing/2010/main" val="0"/>
@@ -5230,7 +5291,7 @@
                     <pic:cNvPicPr/>
                   </pic:nvPicPr>
                   <pic:blipFill>
-                    <a:blip r:embed="rId28" cstate="print">
+                    <a:blip r:embed="rId29" cstate="print">
                       <a:extLst>
                         <a:ext uri="{28A0092B-C50C-407E-A947-70E740481C1C}">
                           <a14:useLocalDpi xmlns:a14="http://schemas.microsoft.com/office/drawing/2010/main" val="0"/>
@@ -5336,7 +5397,7 @@
                     <pic:cNvPicPr/>
                   </pic:nvPicPr>
                   <pic:blipFill>
-                    <a:blip r:embed="rId29" cstate="print">
+                    <a:blip r:embed="rId30" cstate="print">
                       <a:extLst>
                         <a:ext uri="{28A0092B-C50C-407E-A947-70E740481C1C}">
                           <a14:useLocalDpi xmlns:a14="http://schemas.microsoft.com/office/drawing/2010/main" val="0"/>

</xml_diff>